<commit_message>
Update Customer Campaign Engagement.docx with humanized content
</commit_message>
<xml_diff>
--- a/Customer Campaign Engagement.docx
+++ b/Customer Campaign Engagement.docx
@@ -140,23 +140,7 @@
           <w:sz w:val="28"/>
           <w:szCs w:val="28"/>
         </w:rPr>
-        <w:t xml:space="preserve"> Notebook, which </w:t>
-      </w:r>
-      <w:r>
-        <w:rPr>
-          <w:rFonts w:ascii="Times New Roman" w:hAnsi="Times New Roman" w:cs="Times New Roman"/>
-          <w:sz w:val="28"/>
-          <w:szCs w:val="28"/>
-        </w:rPr>
-        <w:t>analyses</w:t>
-      </w:r>
-      <w:r>
-        <w:rPr>
-          <w:rFonts w:ascii="Times New Roman" w:hAnsi="Times New Roman" w:cs="Times New Roman"/>
-          <w:sz w:val="28"/>
-          <w:szCs w:val="28"/>
-        </w:rPr>
-        <w:t xml:space="preserve"> a database of </w:t>
+        <w:t xml:space="preserve"> Notebook, which analyses a database of </w:t>
       </w:r>
       <w:r>
         <w:rPr>
@@ -254,23 +238,7 @@
           <w:sz w:val="28"/>
           <w:szCs w:val="28"/>
         </w:rPr>
-        <w:t xml:space="preserve">Every marketing contact has a cost, and every positive response </w:t>
-      </w:r>
-      <w:r>
-        <w:rPr>
-          <w:rFonts w:ascii="Times New Roman" w:hAnsi="Times New Roman" w:cs="Times New Roman"/>
-          <w:sz w:val="28"/>
-          <w:szCs w:val="28"/>
-        </w:rPr>
-        <w:t>yield</w:t>
-      </w:r>
-      <w:r>
-        <w:rPr>
-          <w:rFonts w:ascii="Times New Roman" w:hAnsi="Times New Roman" w:cs="Times New Roman"/>
-          <w:sz w:val="28"/>
-          <w:szCs w:val="28"/>
-        </w:rPr>
-        <w:t xml:space="preserve"> revenue. The goal is to </w:t>
+        <w:t>Every marketing contact has a cost, and every positive response yield revenue. The goal is to </w:t>
       </w:r>
       <w:r>
         <w:rPr>
@@ -535,20 +503,10 @@
       <w:r>
         <w:rPr>
           <w:rFonts w:ascii="Times New Roman" w:hAnsi="Times New Roman" w:cs="Times New Roman"/>
-          <w:i/>
-          <w:iCs/>
-          <w:sz w:val="28"/>
-          <w:szCs w:val="28"/>
-        </w:rPr>
-        <w:t>What was done:</w:t>
-      </w:r>
-      <w:r>
-        <w:rPr>
-          <w:rFonts w:ascii="Times New Roman" w:hAnsi="Times New Roman" w:cs="Times New Roman"/>
-          <w:sz w:val="28"/>
-          <w:szCs w:val="28"/>
-        </w:rPr>
-        <w:t> Scanned data dimensions (2,240 rows by 29 columns) and checked for duplicates (0 found).</w:t>
+          <w:sz w:val="28"/>
+          <w:szCs w:val="28"/>
+        </w:rPr>
+        <w:t>What was done: Scanned data dimensions (2,240 rows by 29 columns) and checked for duplicates (0 found).</w:t>
       </w:r>
     </w:p>
     <w:p>
@@ -566,20 +524,10 @@
       <w:r>
         <w:rPr>
           <w:rFonts w:ascii="Times New Roman" w:hAnsi="Times New Roman" w:cs="Times New Roman"/>
-          <w:i/>
-          <w:iCs/>
-          <w:sz w:val="28"/>
-          <w:szCs w:val="28"/>
-        </w:rPr>
-        <w:t>Why it matters:</w:t>
-      </w:r>
-      <w:r>
-        <w:rPr>
-          <w:rFonts w:ascii="Times New Roman" w:hAnsi="Times New Roman" w:cs="Times New Roman"/>
-          <w:sz w:val="28"/>
-          <w:szCs w:val="28"/>
-        </w:rPr>
-        <w:t> Establishes the baseline quality of the dataset.</w:t>
+          <w:sz w:val="28"/>
+          <w:szCs w:val="28"/>
+        </w:rPr>
+        <w:t>Why it matters: Establishes the baseline quality of the dataset.</w:t>
       </w:r>
     </w:p>
     <w:p>
@@ -620,20 +568,10 @@
       <w:r>
         <w:rPr>
           <w:rFonts w:ascii="Times New Roman" w:hAnsi="Times New Roman" w:cs="Times New Roman"/>
-          <w:i/>
-          <w:iCs/>
-          <w:sz w:val="28"/>
-          <w:szCs w:val="28"/>
-        </w:rPr>
-        <w:t>What was done:</w:t>
-      </w:r>
-      <w:r>
-        <w:rPr>
-          <w:rFonts w:ascii="Times New Roman" w:hAnsi="Times New Roman" w:cs="Times New Roman"/>
-          <w:sz w:val="28"/>
-          <w:szCs w:val="28"/>
-        </w:rPr>
-        <w:t> Used an </w:t>
+          <w:sz w:val="28"/>
+          <w:szCs w:val="28"/>
+        </w:rPr>
+        <w:t>What was done: Used an </w:t>
       </w:r>
       <w:r>
         <w:rPr>
@@ -669,20 +607,10 @@
       <w:r>
         <w:rPr>
           <w:rFonts w:ascii="Times New Roman" w:hAnsi="Times New Roman" w:cs="Times New Roman"/>
-          <w:i/>
-          <w:iCs/>
-          <w:sz w:val="28"/>
-          <w:szCs w:val="28"/>
-        </w:rPr>
-        <w:t>Why it matters:</w:t>
-      </w:r>
-      <w:r>
-        <w:rPr>
-          <w:rFonts w:ascii="Times New Roman" w:hAnsi="Times New Roman" w:cs="Times New Roman"/>
-          <w:sz w:val="28"/>
-          <w:szCs w:val="28"/>
-        </w:rPr>
-        <w:t> Avoids deleting valuable customer records by filling gaps using smart algorithms instead of simple averages.</w:t>
+          <w:sz w:val="28"/>
+          <w:szCs w:val="28"/>
+        </w:rPr>
+        <w:t>Why it matters: Avoids deleting valuable customer records by filling gaps using smart algorithms instead of simple averages.</w:t>
       </w:r>
     </w:p>
     <w:p>
@@ -723,20 +651,10 @@
       <w:r>
         <w:rPr>
           <w:rFonts w:ascii="Times New Roman" w:hAnsi="Times New Roman" w:cs="Times New Roman"/>
-          <w:i/>
-          <w:iCs/>
-          <w:sz w:val="28"/>
-          <w:szCs w:val="28"/>
-        </w:rPr>
-        <w:t>What was done:</w:t>
-      </w:r>
-      <w:r>
-        <w:rPr>
-          <w:rFonts w:ascii="Times New Roman" w:hAnsi="Times New Roman" w:cs="Times New Roman"/>
-          <w:sz w:val="28"/>
-          <w:szCs w:val="28"/>
-        </w:rPr>
-        <w:t> Cleaned the Marital Status column by mapping rare strings: "Alone" became "Single", and "YOLO" / "Absurd" became "Other".</w:t>
+          <w:sz w:val="28"/>
+          <w:szCs w:val="28"/>
+        </w:rPr>
+        <w:t>What was done: Cleaned the Marital Status column by mapping rare strings: "Alone" became "Single", and "YOLO" / "Absurd" became "Other".</w:t>
       </w:r>
     </w:p>
     <w:p>
@@ -754,20 +672,10 @@
       <w:r>
         <w:rPr>
           <w:rFonts w:ascii="Times New Roman" w:hAnsi="Times New Roman" w:cs="Times New Roman"/>
-          <w:i/>
-          <w:iCs/>
-          <w:sz w:val="28"/>
-          <w:szCs w:val="28"/>
-        </w:rPr>
-        <w:t>Why it matters:</w:t>
-      </w:r>
-      <w:r>
-        <w:rPr>
-          <w:rFonts w:ascii="Times New Roman" w:hAnsi="Times New Roman" w:cs="Times New Roman"/>
-          <w:sz w:val="28"/>
-          <w:szCs w:val="28"/>
-        </w:rPr>
-        <w:t> Groups similar customer profiles together to prevent noise.</w:t>
+          <w:sz w:val="28"/>
+          <w:szCs w:val="28"/>
+        </w:rPr>
+        <w:t>Why it matters: Groups similar customer profiles together to prevent noise.</w:t>
       </w:r>
     </w:p>
     <w:p>
@@ -808,20 +716,10 @@
       <w:r>
         <w:rPr>
           <w:rFonts w:ascii="Times New Roman" w:hAnsi="Times New Roman" w:cs="Times New Roman"/>
-          <w:i/>
-          <w:iCs/>
-          <w:sz w:val="28"/>
-          <w:szCs w:val="28"/>
-        </w:rPr>
-        <w:t>What was done:</w:t>
-      </w:r>
-      <w:r>
-        <w:rPr>
-          <w:rFonts w:ascii="Times New Roman" w:hAnsi="Times New Roman" w:cs="Times New Roman"/>
-          <w:sz w:val="28"/>
-          <w:szCs w:val="28"/>
-        </w:rPr>
-        <w:t> Identified extreme values using the </w:t>
+          <w:sz w:val="28"/>
+          <w:szCs w:val="28"/>
+        </w:rPr>
+        <w:t>What was done: Identified extreme values using the </w:t>
       </w:r>
       <w:r>
         <w:rPr>
@@ -857,20 +755,10 @@
       <w:r>
         <w:rPr>
           <w:rFonts w:ascii="Times New Roman" w:hAnsi="Times New Roman" w:cs="Times New Roman"/>
-          <w:i/>
-          <w:iCs/>
-          <w:sz w:val="28"/>
-          <w:szCs w:val="28"/>
-        </w:rPr>
-        <w:t>Why it matters:</w:t>
-      </w:r>
-      <w:r>
-        <w:rPr>
-          <w:rFonts w:ascii="Times New Roman" w:hAnsi="Times New Roman" w:cs="Times New Roman"/>
-          <w:sz w:val="28"/>
-          <w:szCs w:val="28"/>
-        </w:rPr>
-        <w:t> Neutralizes massive spikes without deleting customer rows.</w:t>
+          <w:sz w:val="28"/>
+          <w:szCs w:val="28"/>
+        </w:rPr>
+        <w:t>Why it matters: Neutralizes massive spikes without deleting customer rows.</w:t>
       </w:r>
     </w:p>
     <w:p>
@@ -911,20 +799,10 @@
       <w:r>
         <w:rPr>
           <w:rFonts w:ascii="Times New Roman" w:hAnsi="Times New Roman" w:cs="Times New Roman"/>
-          <w:i/>
-          <w:iCs/>
-          <w:sz w:val="28"/>
-          <w:szCs w:val="28"/>
-        </w:rPr>
-        <w:t>What was done:</w:t>
-      </w:r>
-      <w:r>
-        <w:rPr>
-          <w:rFonts w:ascii="Times New Roman" w:hAnsi="Times New Roman" w:cs="Times New Roman"/>
-          <w:sz w:val="28"/>
-          <w:szCs w:val="28"/>
-        </w:rPr>
-        <w:t> Applied a log transformation (np.log1p) to highly skewed spending and income columns.</w:t>
+          <w:sz w:val="28"/>
+          <w:szCs w:val="28"/>
+        </w:rPr>
+        <w:t>What was done: Applied a log transformation (np.log1p) to highly skewed spending and income columns.</w:t>
       </w:r>
     </w:p>
     <w:p>
@@ -942,20 +820,10 @@
       <w:r>
         <w:rPr>
           <w:rFonts w:ascii="Times New Roman" w:hAnsi="Times New Roman" w:cs="Times New Roman"/>
-          <w:i/>
-          <w:iCs/>
-          <w:sz w:val="28"/>
-          <w:szCs w:val="28"/>
-        </w:rPr>
-        <w:t>Why it matters:</w:t>
-      </w:r>
-      <w:r>
-        <w:rPr>
-          <w:rFonts w:ascii="Times New Roman" w:hAnsi="Times New Roman" w:cs="Times New Roman"/>
-          <w:sz w:val="28"/>
-          <w:szCs w:val="28"/>
-        </w:rPr>
-        <w:t> Evens out the distributions so models can learn patterns more easily.</w:t>
+          <w:sz w:val="28"/>
+          <w:szCs w:val="28"/>
+        </w:rPr>
+        <w:t>Why it matters: Evens out the distributions so models can learn patterns more easily.</w:t>
       </w:r>
     </w:p>
     <w:p>
@@ -996,20 +864,10 @@
       <w:r>
         <w:rPr>
           <w:rFonts w:ascii="Times New Roman" w:hAnsi="Times New Roman" w:cs="Times New Roman"/>
-          <w:i/>
-          <w:iCs/>
-          <w:sz w:val="28"/>
-          <w:szCs w:val="28"/>
-        </w:rPr>
-        <w:t>What was done:</w:t>
-      </w:r>
-      <w:r>
-        <w:rPr>
-          <w:rFonts w:ascii="Times New Roman" w:hAnsi="Times New Roman" w:cs="Times New Roman"/>
-          <w:sz w:val="28"/>
-          <w:szCs w:val="28"/>
-        </w:rPr>
-        <w:t> Derived 4 custom columns:</w:t>
+          <w:sz w:val="28"/>
+          <w:szCs w:val="28"/>
+        </w:rPr>
+        <w:t>What was done: Derived 4 custom columns:</w:t>
       </w:r>
     </w:p>
     <w:p>
@@ -1152,20 +1010,10 @@
       <w:r>
         <w:rPr>
           <w:rFonts w:ascii="Times New Roman" w:hAnsi="Times New Roman" w:cs="Times New Roman"/>
-          <w:i/>
-          <w:iCs/>
-          <w:sz w:val="28"/>
-          <w:szCs w:val="28"/>
-        </w:rPr>
-        <w:t>Why it matters:</w:t>
-      </w:r>
-      <w:r>
-        <w:rPr>
-          <w:rFonts w:ascii="Times New Roman" w:hAnsi="Times New Roman" w:cs="Times New Roman"/>
-          <w:sz w:val="28"/>
-          <w:szCs w:val="28"/>
-        </w:rPr>
-        <w:t> Combines raw data into high-value business metrics.</w:t>
+          <w:sz w:val="28"/>
+          <w:szCs w:val="28"/>
+        </w:rPr>
+        <w:t>Why it matters: Combines raw data into high-value business metrics.</w:t>
       </w:r>
     </w:p>
     <w:p>
@@ -1653,25 +1501,6 @@
           <w:szCs w:val="28"/>
         </w:rPr>
       </w:pPr>
-      <w:r>
-        <w:rPr>
-          <w:rFonts w:ascii="Times New Roman" w:hAnsi="Times New Roman" w:cs="Times New Roman"/>
-          <w:i/>
-          <w:iCs/>
-          <w:sz w:val="28"/>
-          <w:szCs w:val="28"/>
-        </w:rPr>
-        <w:t>Note: All personally identifiable information (PII) like names or phone numbers was stripped and replaced with a synthetic anonymous ID to comply with data privacy laws.</w:t>
-      </w:r>
-    </w:p>
-    <w:p>
-      <w:pPr>
-        <w:rPr>
-          <w:rFonts w:ascii="Times New Roman" w:hAnsi="Times New Roman" w:cs="Times New Roman"/>
-          <w:sz w:val="28"/>
-          <w:szCs w:val="28"/>
-        </w:rPr>
-      </w:pPr>
     </w:p>
     <w:p>
       <w:pPr>
@@ -2055,20 +1884,10 @@
       <w:r>
         <w:rPr>
           <w:rFonts w:ascii="Times New Roman" w:hAnsi="Times New Roman" w:cs="Times New Roman"/>
-          <w:i/>
-          <w:iCs/>
-          <w:sz w:val="28"/>
-          <w:szCs w:val="28"/>
-        </w:rPr>
-        <w:t>Features Selected:</w:t>
-      </w:r>
-      <w:r>
-        <w:rPr>
-          <w:rFonts w:ascii="Times New Roman" w:hAnsi="Times New Roman" w:cs="Times New Roman"/>
-          <w:sz w:val="28"/>
-          <w:szCs w:val="28"/>
-        </w:rPr>
-        <w:t> </w:t>
+          <w:sz w:val="28"/>
+          <w:szCs w:val="28"/>
+        </w:rPr>
+        <w:t>Features Selected: </w:t>
       </w:r>
       <w:proofErr w:type="spellStart"/>
       <w:r>
@@ -2135,20 +1954,10 @@
       <w:r>
         <w:rPr>
           <w:rFonts w:ascii="Times New Roman" w:hAnsi="Times New Roman" w:cs="Times New Roman"/>
-          <w:i/>
-          <w:iCs/>
-          <w:sz w:val="28"/>
-          <w:szCs w:val="28"/>
-        </w:rPr>
-        <w:t>Features Selected:</w:t>
-      </w:r>
-      <w:r>
-        <w:rPr>
-          <w:rFonts w:ascii="Times New Roman" w:hAnsi="Times New Roman" w:cs="Times New Roman"/>
-          <w:sz w:val="28"/>
-          <w:szCs w:val="28"/>
-        </w:rPr>
-        <w:t xml:space="preserve"> Recency, AcceptedCmp3, AcceptedCmp5, </w:t>
+          <w:sz w:val="28"/>
+          <w:szCs w:val="28"/>
+        </w:rPr>
+        <w:t xml:space="preserve">Features Selected: Recency, AcceptedCmp3, AcceptedCmp5, </w:t>
       </w:r>
       <w:proofErr w:type="spellStart"/>
       <w:r>
@@ -2199,7 +2008,6 @@
           <w:sz w:val="28"/>
           <w:szCs w:val="28"/>
         </w:rPr>
-        <w:lastRenderedPageBreak/>
         <w:t>Lasso Regularization (Embedded Method):</w:t>
       </w:r>
       <w:r>
@@ -2226,20 +2034,10 @@
       <w:r>
         <w:rPr>
           <w:rFonts w:ascii="Times New Roman" w:hAnsi="Times New Roman" w:cs="Times New Roman"/>
-          <w:i/>
-          <w:iCs/>
-          <w:sz w:val="28"/>
-          <w:szCs w:val="28"/>
-        </w:rPr>
-        <w:t>Features Selected:</w:t>
-      </w:r>
-      <w:r>
-        <w:rPr>
-          <w:rFonts w:ascii="Times New Roman" w:hAnsi="Times New Roman" w:cs="Times New Roman"/>
-          <w:sz w:val="28"/>
-          <w:szCs w:val="28"/>
-        </w:rPr>
-        <w:t> 19 features (demographics, spends, channels)</w:t>
+          <w:sz w:val="28"/>
+          <w:szCs w:val="28"/>
+        </w:rPr>
+        <w:t>Features Selected: 19 features (demographics, spends, channels)</w:t>
       </w:r>
     </w:p>
     <w:p>
@@ -2262,6 +2060,7 @@
           <w:sz w:val="28"/>
           <w:szCs w:val="28"/>
         </w:rPr>
+        <w:lastRenderedPageBreak/>
         <w:t>Information Gain (Filter Method):</w:t>
       </w:r>
       <w:r>
@@ -2288,20 +2087,10 @@
       <w:r>
         <w:rPr>
           <w:rFonts w:ascii="Times New Roman" w:hAnsi="Times New Roman" w:cs="Times New Roman"/>
-          <w:i/>
-          <w:iCs/>
-          <w:sz w:val="28"/>
-          <w:szCs w:val="28"/>
-        </w:rPr>
-        <w:t>Features Selected (Top 5):</w:t>
-      </w:r>
-      <w:r>
-        <w:rPr>
-          <w:rFonts w:ascii="Times New Roman" w:hAnsi="Times New Roman" w:cs="Times New Roman"/>
-          <w:sz w:val="28"/>
-          <w:szCs w:val="28"/>
-        </w:rPr>
-        <w:t> </w:t>
+          <w:sz w:val="28"/>
+          <w:szCs w:val="28"/>
+        </w:rPr>
+        <w:t>Features Selected (Top 5): </w:t>
       </w:r>
       <w:proofErr w:type="spellStart"/>
       <w:r>
@@ -2386,20 +2175,10 @@
       <w:r>
         <w:rPr>
           <w:rFonts w:ascii="Times New Roman" w:hAnsi="Times New Roman" w:cs="Times New Roman"/>
-          <w:i/>
-          <w:iCs/>
-          <w:sz w:val="28"/>
-          <w:szCs w:val="28"/>
-        </w:rPr>
-        <w:t>Features Selected (Top 5):</w:t>
-      </w:r>
-      <w:r>
-        <w:rPr>
-          <w:rFonts w:ascii="Times New Roman" w:hAnsi="Times New Roman" w:cs="Times New Roman"/>
-          <w:sz w:val="28"/>
-          <w:szCs w:val="28"/>
-        </w:rPr>
-        <w:t> </w:t>
+          <w:sz w:val="28"/>
+          <w:szCs w:val="28"/>
+        </w:rPr>
+        <w:t>Features Selected (Top 5): </w:t>
       </w:r>
       <w:proofErr w:type="spellStart"/>
       <w:r>
@@ -2564,27 +2343,15 @@
         </w:rPr>
         <w:t> 27.54% accepted | </w:t>
       </w:r>
-      <w:proofErr w:type="gramStart"/>
-      <w:r>
-        <w:rPr>
-          <w:rFonts w:ascii="Times New Roman" w:hAnsi="Times New Roman" w:cs="Times New Roman"/>
-          <w:b/>
-          <w:bCs/>
-          <w:sz w:val="28"/>
-          <w:szCs w:val="28"/>
-        </w:rPr>
-        <w:t>Non-Responders</w:t>
-      </w:r>
-      <w:proofErr w:type="gramEnd"/>
-      <w:r>
-        <w:rPr>
-          <w:rFonts w:ascii="Times New Roman" w:hAnsi="Times New Roman" w:cs="Times New Roman"/>
-          <w:b/>
-          <w:bCs/>
-          <w:sz w:val="28"/>
-          <w:szCs w:val="28"/>
-        </w:rPr>
-        <w:t>:</w:t>
+      <w:r>
+        <w:rPr>
+          <w:rFonts w:ascii="Times New Roman" w:hAnsi="Times New Roman" w:cs="Times New Roman"/>
+          <w:b/>
+          <w:bCs/>
+          <w:sz w:val="28"/>
+          <w:szCs w:val="28"/>
+        </w:rPr>
+        <w:t>Non-Responders:</w:t>
       </w:r>
       <w:r>
         <w:rPr>
@@ -2691,27 +2458,15 @@
         </w:rPr>
         <w:t> 23.05% accepted | </w:t>
       </w:r>
-      <w:proofErr w:type="gramStart"/>
-      <w:r>
-        <w:rPr>
-          <w:rFonts w:ascii="Times New Roman" w:hAnsi="Times New Roman" w:cs="Times New Roman"/>
-          <w:b/>
-          <w:bCs/>
-          <w:sz w:val="28"/>
-          <w:szCs w:val="28"/>
-        </w:rPr>
-        <w:t>Non-Responders</w:t>
-      </w:r>
-      <w:proofErr w:type="gramEnd"/>
-      <w:r>
-        <w:rPr>
-          <w:rFonts w:ascii="Times New Roman" w:hAnsi="Times New Roman" w:cs="Times New Roman"/>
-          <w:b/>
-          <w:bCs/>
-          <w:sz w:val="28"/>
-          <w:szCs w:val="28"/>
-        </w:rPr>
-        <w:t>:</w:t>
+      <w:r>
+        <w:rPr>
+          <w:rFonts w:ascii="Times New Roman" w:hAnsi="Times New Roman" w:cs="Times New Roman"/>
+          <w:b/>
+          <w:bCs/>
+          <w:sz w:val="28"/>
+          <w:szCs w:val="28"/>
+        </w:rPr>
+        <w:t>Non-Responders:</w:t>
       </w:r>
       <w:r>
         <w:rPr>
@@ -2985,7 +2740,6 @@
           <w:sz w:val="28"/>
           <w:szCs w:val="28"/>
         </w:rPr>
-        <w:lastRenderedPageBreak/>
         <w:t>Responders:</w:t>
       </w:r>
       <w:r>
@@ -2996,27 +2750,15 @@
         </w:rPr>
         <w:t> 29.34% married | </w:t>
       </w:r>
-      <w:proofErr w:type="gramStart"/>
-      <w:r>
-        <w:rPr>
-          <w:rFonts w:ascii="Times New Roman" w:hAnsi="Times New Roman" w:cs="Times New Roman"/>
-          <w:b/>
-          <w:bCs/>
-          <w:sz w:val="28"/>
-          <w:szCs w:val="28"/>
-        </w:rPr>
-        <w:t>Non-Responders</w:t>
-      </w:r>
-      <w:proofErr w:type="gramEnd"/>
-      <w:r>
-        <w:rPr>
-          <w:rFonts w:ascii="Times New Roman" w:hAnsi="Times New Roman" w:cs="Times New Roman"/>
-          <w:b/>
-          <w:bCs/>
-          <w:sz w:val="28"/>
-          <w:szCs w:val="28"/>
-        </w:rPr>
-        <w:t>:</w:t>
+      <w:r>
+        <w:rPr>
+          <w:rFonts w:ascii="Times New Roman" w:hAnsi="Times New Roman" w:cs="Times New Roman"/>
+          <w:b/>
+          <w:bCs/>
+          <w:sz w:val="28"/>
+          <w:szCs w:val="28"/>
+        </w:rPr>
+        <w:t>Non-Responders:</w:t>
       </w:r>
       <w:r>
         <w:rPr>
@@ -3047,6 +2789,7 @@
           <w:sz w:val="28"/>
           <w:szCs w:val="28"/>
         </w:rPr>
+        <w:lastRenderedPageBreak/>
         <w:t>Interpretation:</w:t>
       </w:r>
       <w:r>
@@ -3087,8 +2830,6 @@
       <w:r>
         <w:rPr>
           <w:rFonts w:ascii="Times New Roman" w:hAnsi="Times New Roman" w:cs="Times New Roman"/>
-          <w:i/>
-          <w:iCs/>
           <w:sz w:val="28"/>
           <w:szCs w:val="28"/>
         </w:rPr>
@@ -3399,43 +3140,7 @@
           <w:sz w:val="28"/>
           <w:szCs w:val="28"/>
         </w:rPr>
-        <w:t> </w:t>
-      </w:r>
-      <w:r>
-        <w:rPr>
-          <w:rFonts w:ascii="Times New Roman" w:hAnsi="Times New Roman" w:cs="Times New Roman"/>
-          <w:i/>
-          <w:iCs/>
-          <w:sz w:val="28"/>
-          <w:szCs w:val="28"/>
-        </w:rPr>
-        <w:t>Imputation of missing values</w:t>
-      </w:r>
-      <w:r>
-        <w:rPr>
-          <w:rFonts w:ascii="Times New Roman" w:hAnsi="Times New Roman" w:cs="Times New Roman"/>
-          <w:sz w:val="28"/>
-          <w:szCs w:val="28"/>
-        </w:rPr>
-        <w:t> and </w:t>
-      </w:r>
-      <w:r>
-        <w:rPr>
-          <w:rFonts w:ascii="Times New Roman" w:hAnsi="Times New Roman" w:cs="Times New Roman"/>
-          <w:i/>
-          <w:iCs/>
-          <w:sz w:val="28"/>
-          <w:szCs w:val="28"/>
-        </w:rPr>
-        <w:t>Sequential Feature Selection</w:t>
-      </w:r>
-      <w:r>
-        <w:rPr>
-          <w:rFonts w:ascii="Times New Roman" w:hAnsi="Times New Roman" w:cs="Times New Roman"/>
-          <w:sz w:val="28"/>
-          <w:szCs w:val="28"/>
-        </w:rPr>
-        <w:t> (Pedregosa et al., 2011).</w:t>
+        <w:t> Imputation of missing values and Sequential Feature Selection (Pedregosa et al., 2011).</w:t>
       </w:r>
     </w:p>
     <w:p>
@@ -3466,25 +3171,7 @@
           <w:sz w:val="28"/>
           <w:szCs w:val="28"/>
         </w:rPr>
-        <w:t> </w:t>
-      </w:r>
-      <w:r>
-        <w:rPr>
-          <w:rFonts w:ascii="Times New Roman" w:hAnsi="Times New Roman" w:cs="Times New Roman"/>
-          <w:i/>
-          <w:iCs/>
-          <w:sz w:val="28"/>
-          <w:szCs w:val="28"/>
-        </w:rPr>
-        <w:t>Strategic Database Marketing</w:t>
-      </w:r>
-      <w:r>
-        <w:rPr>
-          <w:rFonts w:ascii="Times New Roman" w:hAnsi="Times New Roman" w:cs="Times New Roman"/>
-          <w:sz w:val="28"/>
-          <w:szCs w:val="28"/>
-        </w:rPr>
-        <w:t xml:space="preserve"> (Hughes, 2006). Explains the foundations of RFM (Recency, Frequency, Monetary) </w:t>
+        <w:t xml:space="preserve"> Strategic Database Marketing (Hughes, 2006). Explains the foundations of RFM (Recency, Frequency, Monetary) </w:t>
       </w:r>
       <w:proofErr w:type="spellStart"/>
       <w:r>
@@ -3525,7 +3212,6 @@
           <w:sz w:val="28"/>
           <w:szCs w:val="28"/>
         </w:rPr>
-        <w:lastRenderedPageBreak/>
         <w:t>Lasso Theory:</w:t>
       </w:r>
       <w:r>
@@ -3534,25 +3220,7 @@
           <w:sz w:val="28"/>
           <w:szCs w:val="28"/>
         </w:rPr>
-        <w:t> </w:t>
-      </w:r>
-      <w:r>
-        <w:rPr>
-          <w:rFonts w:ascii="Times New Roman" w:hAnsi="Times New Roman" w:cs="Times New Roman"/>
-          <w:i/>
-          <w:iCs/>
-          <w:sz w:val="28"/>
-          <w:szCs w:val="28"/>
-        </w:rPr>
-        <w:t>Regression shrinkage and selection via the lasso</w:t>
-      </w:r>
-      <w:r>
-        <w:rPr>
-          <w:rFonts w:ascii="Times New Roman" w:hAnsi="Times New Roman" w:cs="Times New Roman"/>
-          <w:sz w:val="28"/>
-          <w:szCs w:val="28"/>
-        </w:rPr>
-        <w:t> (</w:t>
+        <w:t> Regression shrinkage and selection via the lasso (</w:t>
       </w:r>
       <w:proofErr w:type="spellStart"/>
       <w:r>
@@ -3593,6 +3261,7 @@
           <w:sz w:val="28"/>
           <w:szCs w:val="28"/>
         </w:rPr>
+        <w:lastRenderedPageBreak/>
         <w:t>Information Theory:</w:t>
       </w:r>
       <w:r>
@@ -3601,25 +3270,7 @@
           <w:sz w:val="28"/>
           <w:szCs w:val="28"/>
         </w:rPr>
-        <w:t> </w:t>
-      </w:r>
-      <w:r>
-        <w:rPr>
-          <w:rFonts w:ascii="Times New Roman" w:hAnsi="Times New Roman" w:cs="Times New Roman"/>
-          <w:i/>
-          <w:iCs/>
-          <w:sz w:val="28"/>
-          <w:szCs w:val="28"/>
-        </w:rPr>
-        <w:t>Elements of Information Theory</w:t>
-      </w:r>
-      <w:r>
-        <w:rPr>
-          <w:rFonts w:ascii="Times New Roman" w:hAnsi="Times New Roman" w:cs="Times New Roman"/>
-          <w:sz w:val="28"/>
-          <w:szCs w:val="28"/>
-        </w:rPr>
-        <w:t> (Cover &amp; Thomas, 2006). Explains the math behind Mutual Information and Information Gain.</w:t>
+        <w:t> Elements of Information Theory (Cover &amp; Thomas, 2006). Explains the math behind Mutual Information and Information Gain.</w:t>
       </w:r>
     </w:p>
     <w:p>
@@ -5897,6 +5548,7 @@
   <w:style w:type="character" w:default="1" w:styleId="DefaultParagraphFont">
     <w:name w:val="Default Paragraph Font"/>
     <w:uiPriority w:val="1"/>
+    <w:semiHidden/>
     <w:unhideWhenUsed/>
   </w:style>
   <w:style w:type="table" w:default="1" w:styleId="TableNormal">

</xml_diff>